<commit_message>
feat: add the functionality for automatic creation of agreements
</commit_message>
<xml_diff>
--- a/resources/templates/Plantilla_convenios.docx
+++ b/resources/templates/Plantilla_convenios.docx
@@ -37,13 +37,13 @@
           <w:szCs w:val="24"/>
           <w:lang w:val="x-none"/>
         </w:rPr>
-        <w:pict w14:anchorId="1A0E191C">
+        <w:pict w14:anchorId="08DBBA32">
           <v:shapetype id="_x0000_t201" coordsize="21600,21600" o:spt="201" path="m,l,21600r21600,l21600,xe">
             <v:stroke joinstyle="miter"/>
             <v:path shadowok="f" o:extrusionok="f" strokeok="f" fillok="f" o:connecttype="rect"/>
             <o:lock v:ext="edit" shapetype="t"/>
           </v:shapetype>
-          <v:shape id="_x0000_s1032" type="#_x0000_t201" alt="" style="position:absolute;left:0;text-align:left;margin-left:-135.2pt;margin-top:-34.25pt;width:83.25pt;height:36.75pt;z-index:251658240;mso-wrap-edited:f;mso-width-percent:0;mso-height-percent:0;mso-position-horizontal-relative:text;mso-position-vertical-relative:text;mso-width-percent:0;mso-height-percent:0" o:preferrelative="t" filled="f" stroked="f">
+          <v:shape id="_x0000_s1027" type="#_x0000_t201" alt="" style="position:absolute;left:0;text-align:left;margin-left:-135.2pt;margin-top:-34.25pt;width:83.25pt;height:36.75pt;z-index:251658240;mso-wrap-edited:f;mso-width-percent:0;mso-height-percent:0;mso-position-horizontal-relative:text;mso-position-vertical-relative:text;mso-width-percent:0;mso-height-percent:0" o:preferrelative="t" filled="f" stroked="f">
             <v:imagedata r:id="rId7" o:title=""/>
             <o:lock v:ext="edit" aspectratio="t"/>
           </v:shape>
@@ -206,7 +206,7 @@
                 <w:sz w:val="18"/>
                 <w:szCs w:val="18"/>
               </w:rPr>
-              <w:t xml:space="preserve">____________________, </w:t>
+              <w:t>${LUGAR_NACIMIENTO}</w:t>
             </w:r>
             <w:r>
               <w:rPr>
@@ -215,7 +215,16 @@
                 <w:sz w:val="18"/>
                 <w:szCs w:val="18"/>
               </w:rPr>
-              <w:t>__________________________</w:t>
+              <w:t xml:space="preserve">, </w:t>
+            </w:r>
+            <w:r>
+              <w:rPr>
+                <w:rFonts w:ascii="Tahoma" w:hAnsi="Tahoma" w:cs="Tahoma"/>
+                <w:color w:val="2A2A2A"/>
+                <w:sz w:val="18"/>
+                <w:szCs w:val="18"/>
+              </w:rPr>
+              <w:t>${FECHA_NACIMIENTO}</w:t>
             </w:r>
           </w:p>
         </w:tc>
@@ -723,11 +732,12 @@
       <w:r>
         <w:rPr>
           <w:rFonts w:ascii="Tahoma" w:hAnsi="Tahoma" w:cs="Tahoma"/>
-          <w:sz w:val="16"/>
-          <w:szCs w:val="24"/>
-          <w:lang w:val="x-none"/>
-        </w:rPr>
-        <w:t>_________________________</w:t>
+          <w:color w:val="2A2A2A"/>
+          <w:sz w:val="16"/>
+          <w:szCs w:val="24"/>
+          <w:lang w:val="x-none"/>
+        </w:rPr>
+        <w:t>${DIRECCION}</w:t>
       </w:r>
       <w:r>
         <w:rPr>
@@ -745,7 +755,7 @@
           <w:szCs w:val="24"/>
           <w:lang w:val="x-none"/>
         </w:rPr>
-        <w:t xml:space="preserve"> e identificado(a) con </w:t>
+        <w:t xml:space="preserve">e identificado(a) con </w:t>
       </w:r>
       <w:r>
         <w:rPr>
@@ -821,25 +831,7 @@
           <w:szCs w:val="24"/>
           <w:lang w:val="x-none"/>
         </w:rPr>
-        <w:t xml:space="preserve"> </w:t>
-      </w:r>
-      <w:r>
-        <w:rPr>
-          <w:rFonts w:ascii="Tahoma" w:hAnsi="Tahoma" w:cs="Tahoma"/>
-          <w:b/>
-          <w:sz w:val="16"/>
-          <w:szCs w:val="24"/>
-        </w:rPr>
-        <w:t xml:space="preserve"> </w:t>
-      </w:r>
-      <w:r>
-        <w:rPr>
-          <w:rFonts w:ascii="Tahoma" w:hAnsi="Tahoma" w:cs="Tahoma"/>
-          <w:sz w:val="16"/>
-          <w:szCs w:val="24"/>
-          <w:lang w:val="x-none"/>
-        </w:rPr>
-        <w:t xml:space="preserve">de __________________, </w:t>
+        <w:t xml:space="preserve">, </w:t>
       </w:r>
       <w:r>
         <w:rPr>
@@ -1256,8 +1248,11 @@
       </w:r>
       <w:r>
         <w:rPr>
+          <w:rFonts w:ascii="Tahoma" w:hAnsi="Tahoma" w:cs="Tahoma"/>
           <w:b/>
           <w:bCs/>
+          <w:sz w:val="16"/>
+          <w:szCs w:val="16"/>
         </w:rPr>
         <w:t>${PROCESO}</w:t>
       </w:r>
@@ -1267,8 +1262,8 @@
           <w:b/>
           <w:bCs/>
           <w:color w:val="2A2A2A"/>
-          <w:sz w:val="18"/>
-          <w:szCs w:val="24"/>
+          <w:sz w:val="11"/>
+          <w:szCs w:val="18"/>
         </w:rPr>
         <w:t xml:space="preserve"> </w:t>
       </w:r>
@@ -2122,7 +2117,50 @@
           <w:szCs w:val="24"/>
           <w:lang w:val="x-none"/>
         </w:rPr>
-        <w:t xml:space="preserve">que dio origen </w:t>
+        <w:t xml:space="preserve">que dio origen al mismo. </w:t>
+      </w:r>
+      <w:r>
+        <w:rPr>
+          <w:rFonts w:ascii="Tahoma" w:hAnsi="Tahoma" w:cs="Tahoma"/>
+          <w:b/>
+          <w:bCs/>
+          <w:color w:val="2A2A2A"/>
+          <w:sz w:val="16"/>
+          <w:szCs w:val="24"/>
+          <w:lang w:val="x-none"/>
+        </w:rPr>
+        <w:t>El</w:t>
+      </w:r>
+      <w:r>
+        <w:rPr>
+          <w:rFonts w:ascii="Tahoma" w:hAnsi="Tahoma" w:cs="Tahoma"/>
+          <w:color w:val="2A2A2A"/>
+          <w:sz w:val="16"/>
+          <w:szCs w:val="24"/>
+          <w:lang w:val="x-none"/>
+        </w:rPr>
+        <w:t xml:space="preserve"> </w:t>
+      </w:r>
+      <w:r>
+        <w:rPr>
+          <w:rFonts w:ascii="Tahoma" w:hAnsi="Tahoma" w:cs="Tahoma"/>
+          <w:b/>
+          <w:color w:val="2A2A2A"/>
+          <w:sz w:val="16"/>
+          <w:szCs w:val="24"/>
+          <w:lang w:val="x-none"/>
+        </w:rPr>
+        <w:t xml:space="preserve">AFILIADO PARTICIPE </w:t>
+      </w:r>
+      <w:r>
+        <w:rPr>
+          <w:rFonts w:ascii="Tahoma" w:hAnsi="Tahoma" w:cs="Tahoma"/>
+          <w:color w:val="2A2A2A"/>
+          <w:sz w:val="16"/>
+          <w:szCs w:val="24"/>
+          <w:lang w:val="x-none"/>
+        </w:rPr>
+        <w:t xml:space="preserve">autoriza a que le sea </w:t>
       </w:r>
       <w:r>
         <w:rPr>
@@ -2133,50 +2171,7 @@
           <w:lang w:val="x-none"/>
         </w:rPr>
         <w:lastRenderedPageBreak/>
-        <w:t xml:space="preserve">al mismo. </w:t>
-      </w:r>
-      <w:r>
-        <w:rPr>
-          <w:rFonts w:ascii="Tahoma" w:hAnsi="Tahoma" w:cs="Tahoma"/>
-          <w:b/>
-          <w:bCs/>
-          <w:color w:val="2A2A2A"/>
-          <w:sz w:val="16"/>
-          <w:szCs w:val="24"/>
-          <w:lang w:val="x-none"/>
-        </w:rPr>
-        <w:t>El</w:t>
-      </w:r>
-      <w:r>
-        <w:rPr>
-          <w:rFonts w:ascii="Tahoma" w:hAnsi="Tahoma" w:cs="Tahoma"/>
-          <w:color w:val="2A2A2A"/>
-          <w:sz w:val="16"/>
-          <w:szCs w:val="24"/>
-          <w:lang w:val="x-none"/>
-        </w:rPr>
-        <w:t xml:space="preserve"> </w:t>
-      </w:r>
-      <w:r>
-        <w:rPr>
-          <w:rFonts w:ascii="Tahoma" w:hAnsi="Tahoma" w:cs="Tahoma"/>
-          <w:b/>
-          <w:color w:val="2A2A2A"/>
-          <w:sz w:val="16"/>
-          <w:szCs w:val="24"/>
-          <w:lang w:val="x-none"/>
-        </w:rPr>
-        <w:t xml:space="preserve">AFILIADO PARTICIPE </w:t>
-      </w:r>
-      <w:r>
-        <w:rPr>
-          <w:rFonts w:ascii="Tahoma" w:hAnsi="Tahoma" w:cs="Tahoma"/>
-          <w:color w:val="2A2A2A"/>
-          <w:sz w:val="16"/>
-          <w:szCs w:val="24"/>
-          <w:lang w:val="x-none"/>
-        </w:rPr>
-        <w:t xml:space="preserve">autoriza a que le sea descontado de su compensación el valor de la glosa que le corresponde. </w:t>
+        <w:t xml:space="preserve">descontado de su compensación el valor de la glosa que le corresponde. </w:t>
       </w:r>
       <w:r>
         <w:rPr>
@@ -3057,7 +3052,6 @@
           <w:color w:val="2A2A2A"/>
           <w:sz w:val="16"/>
           <w:szCs w:val="16"/>
-          <w:lang w:val="es-419"/>
         </w:rPr>
         <w:t xml:space="preserve"> </w:t>
       </w:r>
@@ -3066,175 +3060,8 @@
           <w:rFonts w:ascii="Tahoma" w:hAnsi="Tahoma" w:cs="Tahoma"/>
           <w:color w:val="2A2A2A"/>
           <w:sz w:val="16"/>
-          <w:szCs w:val="16"/>
-        </w:rPr>
-        <w:fldChar w:fldCharType="begin"/>
-      </w:r>
-      <w:r>
-        <w:rPr>
-          <w:rFonts w:ascii="Tahoma" w:hAnsi="Tahoma" w:cs="Tahoma"/>
-          <w:color w:val="2A2A2A"/>
-          <w:sz w:val="16"/>
-          <w:szCs w:val="16"/>
-        </w:rPr>
-        <w:instrText xml:space="preserve"> IF </w:instrText>
-      </w:r>
-      <w:r>
-        <w:rPr>
-          <w:rFonts w:ascii="Tahoma" w:hAnsi="Tahoma" w:cs="Tahoma"/>
-          <w:color w:val="2A2A2A"/>
-          <w:sz w:val="16"/>
-          <w:szCs w:val="16"/>
-        </w:rPr>
-        <w:fldChar w:fldCharType="begin"/>
-      </w:r>
-      <w:r>
-        <w:rPr>
-          <w:rFonts w:ascii="Tahoma" w:hAnsi="Tahoma" w:cs="Tahoma"/>
-          <w:color w:val="2A2A2A"/>
-          <w:sz w:val="16"/>
-          <w:szCs w:val="16"/>
-        </w:rPr>
-        <w:instrText xml:space="preserve"> MERGEFIELD FECHA_DE_INICIO </w:instrText>
-      </w:r>
-      <w:r>
-        <w:rPr>
-          <w:rFonts w:ascii="Tahoma" w:hAnsi="Tahoma" w:cs="Tahoma"/>
-          <w:color w:val="2A2A2A"/>
-          <w:sz w:val="16"/>
-          <w:szCs w:val="16"/>
-        </w:rPr>
-        <w:fldChar w:fldCharType="separate"/>
-      </w:r>
-      <w:r>
-        <w:rPr>
-          <w:rFonts w:ascii="Tahoma" w:hAnsi="Tahoma" w:cs="Tahoma"/>
-          <w:noProof/>
-          <w:color w:val="2A2A2A"/>
-          <w:sz w:val="16"/>
-          <w:szCs w:val="16"/>
-        </w:rPr>
-        <w:instrText>01/ene/2026</w:instrText>
-      </w:r>
-      <w:r>
-        <w:rPr>
-          <w:rFonts w:ascii="Tahoma" w:hAnsi="Tahoma" w:cs="Tahoma"/>
-          <w:color w:val="2A2A2A"/>
-          <w:sz w:val="16"/>
-          <w:szCs w:val="16"/>
-        </w:rPr>
-        <w:fldChar w:fldCharType="end"/>
-      </w:r>
-      <w:r>
-        <w:rPr>
-          <w:rFonts w:ascii="Tahoma" w:hAnsi="Tahoma" w:cs="Tahoma"/>
-          <w:color w:val="2A2A2A"/>
-          <w:sz w:val="16"/>
-          <w:szCs w:val="16"/>
-        </w:rPr>
-        <w:instrText>&lt;&gt;"" "</w:instrText>
-      </w:r>
-      <w:r>
-        <w:rPr>
-          <w:rFonts w:ascii="Tahoma" w:hAnsi="Tahoma" w:cs="Tahoma"/>
-          <w:color w:val="2A2A2A"/>
-          <w:sz w:val="16"/>
-          <w:szCs w:val="16"/>
-        </w:rPr>
-        <w:fldChar w:fldCharType="begin"/>
-      </w:r>
-      <w:r>
-        <w:rPr>
-          <w:rFonts w:ascii="Tahoma" w:hAnsi="Tahoma" w:cs="Tahoma"/>
-          <w:color w:val="2A2A2A"/>
-          <w:sz w:val="16"/>
-          <w:szCs w:val="16"/>
-        </w:rPr>
-        <w:instrText xml:space="preserve"> MERGEFIELD </w:instrText>
-      </w:r>
-      <w:r>
-        <w:rPr>
-          <w:rFonts w:ascii="Tahoma" w:hAnsi="Tahoma" w:cs="Tahoma"/>
-          <w:color w:val="2A2A2A"/>
-          <w:sz w:val="16"/>
-          <w:szCs w:val="16"/>
-          <w:u w:val="single"/>
-        </w:rPr>
-        <w:instrText>FECHA_DE_INICIO  \@ "dd 'de' MMMM 'de' yyyy"</w:instrText>
-      </w:r>
-      <w:r>
-        <w:rPr>
-          <w:rFonts w:ascii="Tahoma" w:hAnsi="Tahoma" w:cs="Tahoma"/>
-          <w:color w:val="2A2A2A"/>
-          <w:sz w:val="16"/>
-          <w:szCs w:val="16"/>
-        </w:rPr>
-        <w:instrText xml:space="preserve">  </w:instrText>
-      </w:r>
-      <w:r>
-        <w:rPr>
-          <w:rFonts w:ascii="Tahoma" w:hAnsi="Tahoma" w:cs="Tahoma"/>
-          <w:color w:val="2A2A2A"/>
-          <w:sz w:val="16"/>
-          <w:szCs w:val="16"/>
-        </w:rPr>
-        <w:fldChar w:fldCharType="separate"/>
-      </w:r>
-      <w:r>
-        <w:rPr>
-          <w:rFonts w:ascii="Tahoma" w:hAnsi="Tahoma" w:cs="Tahoma"/>
-          <w:noProof/>
-          <w:color w:val="2A2A2A"/>
-          <w:sz w:val="16"/>
-          <w:szCs w:val="16"/>
-        </w:rPr>
-        <w:instrText>01 de enero de 2026</w:instrText>
-      </w:r>
-      <w:r>
-        <w:rPr>
-          <w:rFonts w:ascii="Tahoma" w:hAnsi="Tahoma" w:cs="Tahoma"/>
-          <w:color w:val="2A2A2A"/>
-          <w:sz w:val="16"/>
-          <w:szCs w:val="16"/>
-        </w:rPr>
-        <w:fldChar w:fldCharType="end"/>
-      </w:r>
-      <w:r>
-        <w:rPr>
-          <w:rFonts w:ascii="Tahoma" w:hAnsi="Tahoma" w:cs="Tahoma"/>
-          <w:color w:val="2A2A2A"/>
-          <w:sz w:val="16"/>
-          <w:szCs w:val="16"/>
-        </w:rPr>
-        <w:instrText xml:space="preserve">" "__________________________" </w:instrText>
-      </w:r>
-      <w:r>
-        <w:rPr>
-          <w:rFonts w:ascii="Tahoma" w:hAnsi="Tahoma" w:cs="Tahoma"/>
-          <w:color w:val="2A2A2A"/>
-          <w:sz w:val="16"/>
-          <w:szCs w:val="16"/>
-        </w:rPr>
-        <w:fldChar w:fldCharType="separate"/>
-      </w:r>
-      <w:r>
-        <w:rPr>
-          <w:rFonts w:ascii="Tahoma" w:hAnsi="Tahoma" w:cs="Tahoma"/>
-          <w:noProof/>
-          <w:color w:val="2A2A2A"/>
-          <w:sz w:val="16"/>
-          <w:szCs w:val="16"/>
-        </w:rPr>
-        <w:t>01 de enero de 2026</w:t>
-      </w:r>
-      <w:r>
-        <w:rPr>
-          <w:rFonts w:ascii="Tahoma" w:hAnsi="Tahoma" w:cs="Tahoma"/>
-          <w:color w:val="2A2A2A"/>
-          <w:sz w:val="16"/>
-          <w:szCs w:val="16"/>
-        </w:rPr>
-        <w:fldChar w:fldCharType="end"/>
+        </w:rPr>
+        <w:t>${FECHA}</w:t>
       </w:r>
       <w:r>
         <w:rPr>
@@ -3513,124 +3340,7 @@
                 <w:szCs w:val="24"/>
                 <w:lang w:val="es-419"/>
               </w:rPr>
-              <w:fldChar w:fldCharType="begin"/>
-            </w:r>
-            <w:r>
-              <w:rPr>
-                <w:rFonts w:ascii="Tahoma" w:hAnsi="Tahoma" w:cs="Tahoma"/>
-                <w:sz w:val="16"/>
-                <w:szCs w:val="24"/>
-                <w:lang w:val="es-419"/>
-              </w:rPr>
-              <w:instrText xml:space="preserve"> </w:instrText>
-            </w:r>
-            <w:r>
-              <w:rPr>
-                <w:rFonts w:ascii="Tahoma" w:hAnsi="Tahoma" w:cs="Tahoma"/>
-                <w:b/>
-                <w:bCs/>
-                <w:sz w:val="16"/>
-                <w:szCs w:val="24"/>
-                <w:lang w:val="es-419"/>
-              </w:rPr>
-              <w:instrText xml:space="preserve">IF </w:instrText>
-            </w:r>
-            <w:r>
-              <w:rPr>
-                <w:rFonts w:ascii="Tahoma" w:hAnsi="Tahoma" w:cs="Tahoma"/>
-                <w:b/>
-                <w:bCs/>
-                <w:sz w:val="16"/>
-                <w:szCs w:val="24"/>
-                <w:lang w:val="es-419"/>
-              </w:rPr>
-              <w:fldChar w:fldCharType="begin"/>
-            </w:r>
-            <w:r>
-              <w:rPr>
-                <w:rFonts w:ascii="Tahoma" w:hAnsi="Tahoma" w:cs="Tahoma"/>
-                <w:b/>
-                <w:bCs/>
-                <w:sz w:val="16"/>
-                <w:szCs w:val="24"/>
-                <w:lang w:val="es-419"/>
-              </w:rPr>
-              <w:instrText xml:space="preserve"> MERGEFIELD NOMBRES </w:instrText>
-            </w:r>
-            <w:r>
-              <w:rPr>
-                <w:rFonts w:ascii="Tahoma" w:hAnsi="Tahoma" w:cs="Tahoma"/>
-                <w:b/>
-                <w:bCs/>
-                <w:sz w:val="16"/>
-                <w:szCs w:val="24"/>
-                <w:lang w:val="es-419"/>
-              </w:rPr>
-              <w:fldChar w:fldCharType="separate"/>
-            </w:r>
-            <w:r>
-              <w:rPr>
-                <w:rFonts w:ascii="Tahoma" w:hAnsi="Tahoma" w:cs="Tahoma"/>
-                <w:b/>
-                <w:bCs/>
-                <w:noProof/>
-                <w:sz w:val="16"/>
-                <w:szCs w:val="24"/>
-                <w:lang w:val="es-419"/>
-              </w:rPr>
-              <w:instrText>Nombres del 1</w:instrText>
-            </w:r>
-            <w:r>
-              <w:rPr>
-                <w:rFonts w:ascii="Tahoma" w:hAnsi="Tahoma" w:cs="Tahoma"/>
-                <w:b/>
-                <w:bCs/>
-                <w:sz w:val="16"/>
-                <w:szCs w:val="24"/>
-                <w:lang w:val="es-419"/>
-              </w:rPr>
-              <w:fldChar w:fldCharType="end"/>
-            </w:r>
-            <w:r>
-              <w:rPr>
-                <w:rFonts w:ascii="Tahoma" w:hAnsi="Tahoma" w:cs="Tahoma"/>
-                <w:b/>
-                <w:bCs/>
-                <w:sz w:val="16"/>
-                <w:szCs w:val="24"/>
-                <w:lang w:val="es-419"/>
-              </w:rPr>
-              <w:instrText>&lt;&gt;"" " "</w:instrText>
-            </w:r>
-            <w:r>
-              <w:rPr>
-                <w:rFonts w:ascii="Tahoma" w:hAnsi="Tahoma" w:cs="Tahoma"/>
-                <w:sz w:val="16"/>
-                <w:szCs w:val="24"/>
-                <w:lang w:val="es-419"/>
-              </w:rPr>
-              <w:fldChar w:fldCharType="separate"/>
-            </w:r>
-            <w:r>
-              <w:rPr>
-                <w:rFonts w:ascii="Tahoma" w:hAnsi="Tahoma" w:cs="Tahoma"/>
-                <w:b/>
-                <w:bCs/>
-                <w:noProof/>
-                <w:sz w:val="16"/>
-                <w:szCs w:val="24"/>
-                <w:lang w:val="es-419"/>
-              </w:rPr>
               <w:t xml:space="preserve"> </w:t>
-            </w:r>
-            <w:r>
-              <w:rPr>
-                <w:rFonts w:ascii="Tahoma" w:hAnsi="Tahoma" w:cs="Tahoma"/>
-                <w:sz w:val="16"/>
-                <w:szCs w:val="24"/>
-                <w:lang w:val="es-419"/>
-              </w:rPr>
-              <w:fldChar w:fldCharType="end"/>
             </w:r>
             <w:r>
               <w:rPr>
@@ -3772,59 +3482,6 @@
                 <w:lang w:val="es-419"/>
               </w:rPr>
               <w:t>}</w:t>
-            </w:r>
-            <w:r>
-              <w:rPr>
-                <w:rFonts w:ascii="Tahoma" w:hAnsi="Tahoma" w:cs="Tahoma"/>
-                <w:sz w:val="16"/>
-                <w:szCs w:val="24"/>
-                <w:lang w:val="es-419"/>
-              </w:rPr>
-              <w:t xml:space="preserve"> </w:t>
-            </w:r>
-            <w:r>
-              <w:rPr>
-                <w:rFonts w:ascii="Tahoma" w:hAnsi="Tahoma" w:cs="Tahoma"/>
-                <w:b/>
-                <w:color w:val="000000"/>
-                <w:sz w:val="16"/>
-                <w:szCs w:val="24"/>
-                <w:lang w:val="x-none"/>
-              </w:rPr>
-              <w:t>de ___</w:t>
-            </w:r>
-            <w:r>
-              <w:rPr>
-                <w:rFonts w:ascii="Tahoma" w:hAnsi="Tahoma" w:cs="Tahoma"/>
-                <w:b/>
-                <w:color w:val="000000"/>
-                <w:sz w:val="16"/>
-                <w:szCs w:val="24"/>
-                <w:lang w:val="x-none"/>
-              </w:rPr>
-              <w:t>_____</w:t>
-            </w:r>
-            <w:r>
-              <w:rPr>
-                <w:rFonts w:ascii="Tahoma" w:hAnsi="Tahoma" w:cs="Tahoma"/>
-                <w:b/>
-                <w:color w:val="000000"/>
-                <w:sz w:val="16"/>
-                <w:szCs w:val="24"/>
-                <w:lang w:val="x-none"/>
-              </w:rPr>
-              <w:t>______</w:t>
-            </w:r>
-            <w:r>
-              <w:rPr>
-                <w:rFonts w:ascii="Tahoma" w:hAnsi="Tahoma" w:cs="Tahoma"/>
-                <w:b/>
-                <w:color w:val="000000"/>
-                <w:sz w:val="16"/>
-                <w:szCs w:val="24"/>
-                <w:lang w:val="x-none"/>
-              </w:rPr>
-              <w:t>__</w:t>
             </w:r>
           </w:p>
           <w:p>
@@ -3926,13 +3583,13 @@
       <mc:AlternateContent>
         <mc:Choice Requires="wpg">
           <w:drawing>
-            <wp:anchor distT="0" distB="0" distL="114300" distR="114300" simplePos="0" relativeHeight="251659264" behindDoc="1" locked="0" layoutInCell="1" allowOverlap="1" wp14:anchorId="3AE3653B" wp14:editId="4CE028DA">
+            <wp:anchor distT="0" distB="0" distL="114300" distR="114300" simplePos="0" relativeHeight="251659264" behindDoc="1" locked="0" layoutInCell="1" allowOverlap="1" wp14:anchorId="3AE3653B" wp14:editId="0E8B7BC4">
               <wp:simplePos x="0" y="0"/>
               <wp:positionH relativeFrom="margin">
-                <wp:posOffset>-404037</wp:posOffset>
+                <wp:posOffset>-450752</wp:posOffset>
               </wp:positionH>
               <wp:positionV relativeFrom="paragraph">
-                <wp:posOffset>-365155</wp:posOffset>
+                <wp:posOffset>-200660</wp:posOffset>
               </wp:positionV>
               <wp:extent cx="7712710" cy="9803781"/>
               <wp:effectExtent l="0" t="0" r="2540" b="6985"/>
@@ -4020,7 +3677,7 @@
         </mc:Choice>
         <mc:Fallback>
           <w:pict>
-            <v:group w14:anchorId="305F94A8" id="Grupo 2" o:spid="_x0000_s1026" style="position:absolute;margin-left:-31.8pt;margin-top:-28.75pt;width:607.3pt;height:771.95pt;z-index:-251657216;mso-position-horizontal-relative:margin;mso-height-relative:margin" coordorigin=",-1261" coordsize="77127,98037" o:gfxdata="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">
+            <v:group w14:anchorId="6867BC89" id="Grupo 2" o:spid="_x0000_s1026" style="position:absolute;margin-left:-35.5pt;margin-top:-15.8pt;width:607.3pt;height:771.95pt;z-index:-251657216;mso-position-horizontal-relative:margin;mso-height-relative:margin" coordorigin=",-1261" coordsize="77127,98037" o:gfxdata="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">
               <v:shapetype id="_x0000_t75" coordsize="21600,21600" o:spt="75" o:preferrelative="t" path="m@4@5l@4@11@9@11@9@5xe" filled="f" stroked="f">
                 <v:stroke joinstyle="miter"/>
                 <v:formulas>
@@ -4040,10 +3697,10 @@
                 <v:path o:extrusionok="f" gradientshapeok="t" o:connecttype="rect"/>
                 <o:lock v:ext="edit" aspectratio="t"/>
               </v:shapetype>
-              <v:shape id="Imagen 1" o:spid="_x0000_s1027" type="#_x0000_t75" style="position:absolute;left:53162;top:-1261;width:21685;height:11601;visibility:visible;mso-wrap-style:square" o:gfxdata="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">
+              <v:shape id="Imagen 1" o:spid="_x0000_s1027" type="#_x0000_t75" style="position:absolute;left:53162;top:-1261;width:21685;height:11601;visibility:visible;mso-wrap-style:square" o:gfxdata="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">
                 <v:imagedata r:id="rId3" o:title=""/>
               </v:shape>
-              <v:shape id="Imagen 3" o:spid="_x0000_s1028" type="#_x0000_t75" style="position:absolute;top:82533;width:77127;height:14243;visibility:visible;mso-wrap-style:square" o:gfxdata="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">
+              <v:shape id="Imagen 3" o:spid="_x0000_s1028" type="#_x0000_t75" style="position:absolute;top:82533;width:77127;height:14243;visibility:visible;mso-wrap-style:square" o:gfxdata="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">
                 <v:imagedata r:id="rId4" o:title=""/>
               </v:shape>
               <w10:wrap anchorx="margin"/>

</xml_diff>

<commit_message>
feat: improve the flow and experience of creating agreements
</commit_message>
<xml_diff>
--- a/resources/templates/Plantilla_convenios.docx
+++ b/resources/templates/Plantilla_convenios.docx
@@ -2762,37 +2762,6 @@
           <w:lang w:val="x-none"/>
         </w:rPr>
         <w:t>{DIRECCION}</w:t>
-      </w:r>
-      <w:r>
-        <w:rPr>
-          <w:rFonts w:ascii="Tahoma" w:hAnsi="Tahoma" w:cs="Tahoma"/>
-          <w:color w:val="2A2A2A"/>
-          <w:sz w:val="16"/>
-          <w:szCs w:val="24"/>
-          <w:lang w:val="x-none"/>
-        </w:rPr>
-        <w:t xml:space="preserve">, </w:t>
-      </w:r>
-      <w:r>
-        <w:rPr>
-          <w:rFonts w:ascii="Tahoma" w:hAnsi="Tahoma" w:cs="Tahoma"/>
-          <w:b/>
-          <w:color w:val="2A2A2A"/>
-          <w:sz w:val="16"/>
-          <w:szCs w:val="24"/>
-          <w:lang w:val="x-none"/>
-        </w:rPr>
-        <w:t xml:space="preserve">TELEFONO </w:t>
-      </w:r>
-      <w:r>
-        <w:rPr>
-          <w:rFonts w:ascii="Tahoma" w:hAnsi="Tahoma" w:cs="Tahoma"/>
-          <w:color w:val="2A2A2A"/>
-          <w:sz w:val="16"/>
-          <w:szCs w:val="24"/>
-          <w:lang w:val="x-none"/>
-        </w:rPr>
-        <w:t>${TELEFONO}</w:t>
       </w:r>
       <w:r>
         <w:rPr>

</xml_diff>